<commit_message>
Correct the compute axis in the doc, and trim the prose again
The document said C = 6ND, which is the one thing src/scaling/flops.py
opens by telling you not to substitute. The sweep's axis is
C = 3 * F(N) * D with F computed analytically, because the pointer head
runs 352 times per example and the slot encoder runs over 32 pool slots
rather than the decoder sequence. Over this ladder C/(N*D) falls from
306 to 218, so the heuristic would be off by 36x to 51x and the error
drifts across the grid rather than sitting in a constant. That now has
its own line in a short method section, and the argument in 7.3 no
longer leans on a formula we do not use.

Trimmed elsewhere: job numbers and the chronology of what was found
when are gone, the tables and figures carry more of the load, and the
remaining prose is the learning-rate case.

Co-Authored-By: Claude Opus 5 <noreply@anthropic.com>
Claude-Session: https://claude.ai/code/session_01XghrhY6CG3yHYV4KvDtBnM
</commit_message>
<xml_diff>
--- a/analyses/scaling/results/INDIGO_scaling_meeting.docx
+++ b/analyses/scaling/results/INDIGO_scaling_meeting.docx
@@ -31,36 +31,6 @@
           <w:szCs w:val="24"/>
         </w:rPr>
         <w:t xml:space="preserve">48-run IsoFLOP sweep, 40M corpus, Porian-corrected</w:t>
-      </w:r>
-    </w:p>
-    <w:p>
-      <w:pPr>
-        <w:spacing w:after="200" w:before="0" w:line="276"/>
-      </w:pPr>
-      <w:r>
-        <w:rPr>
-          <w:color w:val="5a5a5a"/>
-          <w:sz w:val="21"/>
-          <w:szCs w:val="21"/>
-        </w:rPr>
-        <w:t xml:space="preserve">Research meeting, 30 September 2026.  Fit artifact: </w:t>
-      </w:r>
-      <w:r>
-        <w:rPr>
-          <w:rFonts w:ascii="Consolas" w:cs="Consolas" w:eastAsia="Consolas" w:hAnsi="Consolas"/>
-          <w:color w:val="1a1a1a"/>
-          <w:sz w:val="19"/>
-          <w:szCs w:val="19"/>
-        </w:rPr>
-        <w:t xml:space="preserve">analyses/scaling/results/isoflop_fit.json</w:t>
-      </w:r>
-      <w:r>
-        <w:rPr>
-          <w:color w:val="5a5a5a"/>
-          <w:sz w:val="21"/>
-          <w:szCs w:val="21"/>
-        </w:rPr>
-        <w:t xml:space="preserve">.</w:t>
       </w:r>
     </w:p>
     <w:p>
@@ -150,7 +120,7 @@
           <w:sz w:val="21"/>
           <w:szCs w:val="21"/>
         </w:rPr>
-        <w:t xml:space="preserve"> and get worse after it. Best pooled ΔE there: 10.04, seed-averaged.</w:t>
+        <w:t xml:space="preserve"> and worsen after. Best pooled ΔE there: 10.04.</w:t>
       </w:r>
     </w:p>
     <w:p>
@@ -234,20 +204,20 @@
           <w:sz w:val="21"/>
           <w:szCs w:val="21"/>
         </w:rPr>
-        <w:t xml:space="preserve"> (α = 0.65, β = 0.40, α + β ≈ 1). The method works where the problem is solvable.</w:t>
-      </w:r>
-    </w:p>
-    <w:p>
-      <w:pPr>
-        <w:spacing w:after="180" w:before="80" w:line="276"/>
-      </w:pPr>
-      <w:r>
-        <w:rPr>
-          <w:color w:val="1a1a1a"/>
-          <w:sz w:val="21"/>
-          <w:szCs w:val="21"/>
-        </w:rPr>
-        <w:t xml:space="preserve">Working claim: the ceiling is problem-side. Section 5 gives the theory. </w:t>
+        <w:t xml:space="preserve"> (α = 0.65, β = 0.40, α + β ≈ 1).</w:t>
+      </w:r>
+    </w:p>
+    <w:p>
+      <w:pPr>
+        <w:spacing w:after="150" w:before="70" w:line="276"/>
+      </w:pPr>
+      <w:r>
+        <w:rPr>
+          <w:color w:val="1a1a1a"/>
+          <w:sz w:val="21"/>
+          <w:szCs w:val="21"/>
+        </w:rPr>
+        <w:t xml:space="preserve">Working claim: the ceiling is problem-side. </w:t>
       </w:r>
       <w:r>
         <w:rPr>
@@ -257,15 +227,7 @@
           <w:sz w:val="21"/>
           <w:szCs w:val="21"/>
         </w:rPr>
-        <w:t xml:space="preserve">Section 6 is the one open confound I cannot rule out yet, and what I would run to close it.</w:t>
-      </w:r>
-      <w:r>
-        <w:rPr>
-          <w:color w:val="1a1a1a"/>
-          <w:sz w:val="21"/>
-          <w:szCs w:val="21"/>
-        </w:rPr>
-        <w:t xml:space="preserve"> That section is the one I want your read on.</w:t>
+        <w:t xml:space="preserve">Section 7 is the one confound I cannot rule out, and what I would run to close it. That is the section I want your read on.</w:t>
       </w:r>
     </w:p>
     <w:p>
@@ -273,7 +235,88 @@
         <w:pStyle w:val="Heading1"/>
       </w:pPr>
       <w:r>
-        <w:t xml:space="preserve">2.  The sweep</w:t>
+        <w:t xml:space="preserve">2.  Method</w:t>
+      </w:r>
+    </w:p>
+    <w:p>
+      <w:pPr>
+        <w:pStyle w:val="ListParagraph"/>
+        <w:numPr>
+          <w:ilvl w:val="0"/>
+          <w:numId w:val="3"/>
+        </w:numPr>
+        <w:spacing w:after="80" w:line="272"/>
+      </w:pPr>
+      <w:r>
+        <w:rPr>
+          <w:color w:val="1a1a1a"/>
+          <w:sz w:val="21"/>
+          <w:szCs w:val="21"/>
+        </w:rPr>
+        <w:t xml:space="preserve">Chinchilla Approach 2. Six budgets × eight runs. Parabola in log N per budget gives N*, then a power law in C. Final checkpoint, aspect ratio held in a 28 to 72 band, D counted in examples.</w:t>
+      </w:r>
+    </w:p>
+    <w:p>
+      <w:pPr>
+        <w:pStyle w:val="ListParagraph"/>
+        <w:numPr>
+          <w:ilvl w:val="0"/>
+          <w:numId w:val="3"/>
+        </w:numPr>
+        <w:spacing w:after="80" w:line="272"/>
+      </w:pPr>
+      <w:r>
+        <w:rPr>
+          <w:b/>
+          <w:bCs/>
+          <w:color w:val="1a1a1a"/>
+          <w:sz w:val="21"/>
+          <w:szCs w:val="21"/>
+        </w:rPr>
+        <w:t xml:space="preserve">The compute axis is not 6ND. </w:t>
+      </w:r>
+      <w:r>
+        <w:rPr>
+          <w:rFonts w:ascii="Consolas" w:cs="Consolas" w:eastAsia="Consolas" w:hAnsi="Consolas"/>
+          <w:color w:val="1a1a1a"/>
+          <w:sz w:val="19"/>
+          <w:szCs w:val="19"/>
+        </w:rPr>
+        <w:t xml:space="preserve">src/scaling/flops.py</w:t>
+      </w:r>
+      <w:r>
+        <w:rPr>
+          <w:color w:val="1a1a1a"/>
+          <w:sz w:val="21"/>
+          <w:szCs w:val="21"/>
+        </w:rPr>
+        <w:t xml:space="preserve"> computes forward FLOPs per example analytically and sets C = 3 · F(N) · D. The pointer head runs per (position, slot), 352 times per example, and the slot encoder runs over 32 pool slots rather than the 11-position sequence. Over this ladder C/(N·D) runs from 306 down to 218, so 6ND would understate compute by 36× to 51× and the error itself drifts 1.4× across the grid. This is Porian correction #1, far larger here than in the paper.</w:t>
+      </w:r>
+    </w:p>
+    <w:p>
+      <w:pPr>
+        <w:pStyle w:val="ListParagraph"/>
+        <w:numPr>
+          <w:ilvl w:val="0"/>
+          <w:numId w:val="3"/>
+        </w:numPr>
+        <w:spacing w:after="80" w:line="272"/>
+      </w:pPr>
+      <w:r>
+        <w:rPr>
+          <w:color w:val="1a1a1a"/>
+          <w:sz w:val="21"/>
+          <w:szCs w:val="21"/>
+        </w:rPr>
+        <w:t xml:space="preserve">Porian #2: warmup as a fraction of the budget. Porian #3: LR re-tuned per scale, which is section 7.</w:t>
+      </w:r>
+    </w:p>
+    <w:p>
+      <w:pPr>
+        <w:pStyle w:val="Heading1"/>
+      </w:pPr>
+      <w:r>
+        <w:t xml:space="preserve">3.  The sweep</w:t>
       </w:r>
     </w:p>
     <w:p>
@@ -353,7 +396,7 @@
           <w:sz w:val="21"/>
           <w:szCs w:val="21"/>
         </w:rPr>
-        <w:t xml:space="preserve">The parabolas flatten as C rises. At C = 8.3e15 the star sits at the edge of the window; at C = 2.5e16 there is no interior minimum and the fit is refused.</w:t>
+        <w:t xml:space="preserve">The parabolas flatten as C rises. At C = 8.3e15 the star sits at the edge of the window; at 2.5e16 there is no interior minimum and the fit is refused.</w:t>
       </w:r>
     </w:p>
     <w:p>
@@ -1721,7 +1764,7 @@
         <w:pStyle w:val="Heading1"/>
       </w:pPr>
       <w:r>
-        <w:t xml:space="preserve">3.  Cross-entropy, same procedure</w:t>
+        <w:t xml:space="preserve">4.  Cross-entropy, same procedure</w:t>
       </w:r>
     </w:p>
     <w:p>
@@ -1783,7 +1826,7 @@
           <w:sz w:val="17"/>
           <w:szCs w:val="17"/>
         </w:rPr>
-        <w:t xml:space="preserve">Figure 2.  Identical IsoFLOP procedure run on val_loss. Panel A has a Chinchilla α = 0.5 slope for reference.</w:t>
+        <w:t xml:space="preserve">Figure 2.  The identical IsoFLOP procedure run on val_loss. Panel A carries a Chinchilla α = 0.5 slope for reference.</w:t>
       </w:r>
     </w:p>
     <w:p>
@@ -1827,7 +1870,7 @@
         <w:pStyle w:val="Heading1"/>
       </w:pPr>
       <w:r>
-        <w:t xml:space="preserve">4.  Epoch-ceiling theory, refuted</w:t>
+        <w:t xml:space="preserve">5.  Epoch-ceiling theory, refuted</w:t>
       </w:r>
     </w:p>
     <w:p>
@@ -1925,7 +1968,7 @@
           <w:sz w:val="21"/>
           <w:szCs w:val="21"/>
         </w:rPr>
-        <w:t xml:space="preserve">. It cannot be memorisation from repeats.</w:t>
+        <w:t xml:space="preserve">, so it is not memorisation from repeats.</w:t>
       </w:r>
     </w:p>
     <w:p>
@@ -1943,7 +1986,7 @@
           <w:sz w:val="21"/>
           <w:szCs w:val="21"/>
         </w:rPr>
-        <w:t xml:space="preserve">In four of the nine right-hand panels, more </w:t>
+        <w:t xml:space="preserve">In four of the nine panels, more </w:t>
       </w:r>
       <w:r>
         <w:rPr>
@@ -1974,7 +2017,7 @@
         <w:pStyle w:val="Heading1"/>
       </w:pPr>
       <w:r>
-        <w:t xml:space="preserve">5.  Where the ceiling comes from</w:t>
+        <w:t xml:space="preserve">6.  Where the ceiling comes from</w:t>
       </w:r>
     </w:p>
     <w:p>
@@ -2955,7 +2998,7 @@
     </w:p>
     <w:p>
       <w:pPr>
-        <w:spacing w:after="60" w:before="140" w:line="276"/>
+        <w:spacing w:after="60" w:before="130" w:line="276"/>
       </w:pPr>
       <w:r>
         <w:rPr>
@@ -2965,15 +3008,7 @@
           <w:sz w:val="21"/>
           <w:szCs w:val="21"/>
         </w:rPr>
-        <w:t xml:space="preserve">Best ΔE₀₀ by bucket across the full 250× span</w:t>
-      </w:r>
-      <w:r>
-        <w:rPr>
-          <w:color w:val="1a1a1a"/>
-          <w:sz w:val="21"/>
-          <w:szCs w:val="21"/>
-        </w:rPr>
-        <w:t xml:space="preserve">   (1e14 → 2.5e16):</w:t>
+        <w:t xml:space="preserve">Table 3.  Best ΔE₀₀ by bucket, across the full 250× span.</w:t>
       </w:r>
     </w:p>
     <w:tbl>
@@ -3935,7 +3970,7 @@
           <w:sz w:val="21"/>
           <w:szCs w:val="21"/>
         </w:rPr>
-        <w:t xml:space="preserve">A floor should be chroma-dependent, and it is: low chroma is the only bucket with a clean, noise-robust law, while high chroma is pinned at 18 to 21.</w:t>
+        <w:t xml:space="preserve">A floor should be chroma-dependent, and is. Low chroma is the only bucket with a clean, noise-robust law; high chroma is pinned at 18 to 21.</w:t>
       </w:r>
     </w:p>
     <w:p>
@@ -3971,7 +4006,7 @@
           <w:sz w:val="21"/>
           <w:szCs w:val="21"/>
         </w:rPr>
-        <w:t xml:space="preserve"> of a still-improving component and a pinned one. Mixtures do not have clean power laws.</w:t>
+        <w:t xml:space="preserve"> of a still-improving component and a pinned one, and mixtures do not have clean power laws.</w:t>
       </w:r>
     </w:p>
     <w:p>
@@ -3992,7 +4027,7 @@
           <w:sz w:val="21"/>
           <w:szCs w:val="21"/>
         </w:rPr>
-        <w:t xml:space="preserve">Not the pool, but the degeneracy: the map from (target Lab, pool) to stack is massively one-to-many, and a point-estimate decoder on a token-level objective cannot rank the degenerate set well enough for its argmax to be good. </w:t>
+        <w:t xml:space="preserve">Not the pool but the degeneracy: the map from (target Lab, pool) to stack is massively one-to-many, and a point-estimate decoder on a token-level objective cannot rank that set well enough for its argmax to be good. </w:t>
       </w:r>
       <w:r>
         <w:rPr>
@@ -4025,7 +4060,7 @@
           <w:sz w:val="21"/>
           <w:szCs w:val="21"/>
         </w:rPr>
-        <w:t xml:space="preserve">oracle-floor eval. For ~2000 val examples compute the best ΔE achievable given that example's own pool, using </w:t>
+        <w:t xml:space="preserve">for ~2000 val examples compute the best ΔE achievable given that example's own pool, using </w:t>
       </w:r>
       <w:r>
         <w:rPr>
@@ -4072,7 +4107,7 @@
         <w:pStyle w:val="Heading1"/>
       </w:pPr>
       <w:r>
-        <w:t xml:space="preserve">6.  Learning rate: what we fit, and what I propose fitting instead</w:t>
+        <w:t xml:space="preserve">7.  Learning rate: what we fit, and what I propose fitting instead</w:t>
       </w:r>
     </w:p>
     <w:p>
@@ -4080,7 +4115,7 @@
         <w:pStyle w:val="Heading2"/>
       </w:pPr>
       <w:r>
-        <w:t xml:space="preserve">6.1  What the sweep does now</w:t>
+        <w:t xml:space="preserve">7.1  What the sweep does now</w:t>
       </w:r>
     </w:p>
     <w:p>
@@ -4093,7 +4128,7 @@
           <w:sz w:val="21"/>
           <w:szCs w:val="21"/>
         </w:rPr>
-        <w:t xml:space="preserve">Porian correction #3 is to re-tune LR at every scale instead of inheriting one global value. We apply it through a fitted law rather than a fresh sweep per config: </w:t>
+        <w:t xml:space="preserve">Porian correction #3 is to re-tune LR at every scale rather than inherit one global value. We apply it through a fitted law rather than a sweep per config: </w:t>
       </w:r>
       <w:r>
         <w:rPr>
@@ -4172,37 +4207,7 @@
           <w:sz w:val="21"/>
           <w:szCs w:val="21"/>
         </w:rPr>
-        <w:t xml:space="preserve">, and every config is assigned </w:t>
-      </w:r>
-      <w:r>
-        <w:rPr>
-          <w:rFonts w:ascii="Consolas" w:cs="Consolas" w:eastAsia="Consolas" w:hAnsi="Consolas"/>
-          <w:color w:val="1a1a1a"/>
-          <w:sz w:val="19"/>
-          <w:szCs w:val="19"/>
-        </w:rPr>
-        <w:t xml:space="preserve">lr_for(n_params)</w:t>
-      </w:r>
-      <w:r>
-        <w:rPr>
-          <w:color w:val="1a1a1a"/>
-          <w:sz w:val="21"/>
-          <w:szCs w:val="21"/>
-        </w:rPr>
-        <w:t xml:space="preserve">. Across the ladder's 220× range in N that runs from 2.58e-3 at the smallest model to 1.21e-4 at the largest.</w:t>
-      </w:r>
-    </w:p>
-    <w:p>
-      <w:pPr>
-        <w:spacing w:after="120" w:before="0" w:line="276"/>
-      </w:pPr>
-      <w:r>
-        <w:rPr>
-          <w:color w:val="1a1a1a"/>
-          <w:sz w:val="21"/>
-          <w:szCs w:val="21"/>
-        </w:rPr>
-        <w:t xml:space="preserve">This was a genuine improvement and I am not proposing we drop it. The production value of 6e-5, tuned for the 69.6M model, left every probe model untrained.</w:t>
+        <w:t xml:space="preserve">. Across the ladder's 220× range in N that runs from 2.58e-3 to 1.21e-4. It is a real improvement on the alternative: the production value of 6e-5 left every probe model untrained.</w:t>
       </w:r>
     </w:p>
     <w:p>
@@ -4210,7 +4215,7 @@
         <w:pStyle w:val="Heading2"/>
       </w:pPr>
       <w:r>
-        <w:t xml:space="preserve">6.2  What the law actually rests on</w:t>
+        <w:t xml:space="preserve">7.2  What the law rests on</w:t>
       </w:r>
     </w:p>
     <w:p>
@@ -4290,7 +4295,7 @@
           <w:sz w:val="21"/>
           <w:szCs w:val="21"/>
         </w:rPr>
-        <w:t xml:space="preserve">The first sweep (jobs 3993622-4) ran d128, d256 and d512 over a </w:t>
+        <w:t xml:space="preserve">Two of the three points come from a </w:t>
       </w:r>
       <w:r>
         <w:rPr>
@@ -4308,7 +4313,7 @@
           <w:sz w:val="21"/>
           <w:szCs w:val="21"/>
         </w:rPr>
-        <w:t xml:space="preserve"> geometric grid, 1e-4 to 3e-3, so the only candidates were {1e-4, 5.48e-4, 3e-3}. </w:t>
+        <w:t xml:space="preserve"> grid, 1e-4 to 3e-3, whose only candidates were {1e-4, 5.48e-4, 3e-3}. </w:t>
       </w:r>
       <w:r>
         <w:rPr>
@@ -4318,15 +4323,15 @@
           <w:sz w:val="21"/>
           <w:szCs w:val="21"/>
         </w:rPr>
-        <w:t xml:space="preserve">All three sizes returned the middle one.</w:t>
-      </w:r>
-      <w:r>
-        <w:rPr>
-          <w:color w:val="1a1a1a"/>
-          <w:sz w:val="21"/>
-          <w:szCs w:val="21"/>
-        </w:rPr>
-        <w:t xml:space="preserve"> That sweep measured no size dependence at all: it is one grid point, three times.</w:t>
+        <w:t xml:space="preserve">Both sizes returned the middle one</w:t>
+      </w:r>
+      <w:r>
+        <w:rPr>
+          <w:color w:val="1a1a1a"/>
+          <w:sz w:val="21"/>
+          <w:szCs w:val="21"/>
+        </w:rPr>
+        <w:t xml:space="preserve">, so that measurement carries no size dependence at all.</w:t>
       </w:r>
     </w:p>
     <w:p>
@@ -4344,24 +4349,7 @@
           <w:sz w:val="21"/>
           <w:szCs w:val="21"/>
         </w:rPr>
-        <w:t xml:space="preserve">The d512 value in </w:t>
-      </w:r>
-      <w:r>
-        <w:rPr>
-          <w:rFonts w:ascii="Consolas" w:cs="Consolas" w:eastAsia="Consolas" w:hAnsi="Consolas"/>
-          <w:color w:val="1a1a1a"/>
-          <w:sz w:val="19"/>
-          <w:szCs w:val="19"/>
-        </w:rPr>
-        <w:t xml:space="preserve">MEASURED_LR</w:t>
-      </w:r>
-      <w:r>
-        <w:rPr>
-          <w:color w:val="1a1a1a"/>
-          <w:sz w:val="21"/>
-          <w:szCs w:val="21"/>
-        </w:rPr>
-        <w:t xml:space="preserve"> comes from a </w:t>
+        <w:t xml:space="preserve">The d512 point comes from a different 4-point grid, 1e-4 to 5e-4, and returned 1.00e-4, which is that grid's lower bound. </w:t>
       </w:r>
       <w:r>
         <w:rPr>
@@ -4371,33 +4359,15 @@
           <w:sz w:val="21"/>
           <w:szCs w:val="21"/>
         </w:rPr>
-        <w:t xml:space="preserve">later, separate</w:t>
-      </w:r>
-      <w:r>
-        <w:rPr>
-          <w:color w:val="1a1a1a"/>
-          <w:sz w:val="21"/>
-          <w:szCs w:val="21"/>
-        </w:rPr>
-        <w:t xml:space="preserve"> run (job 3994485) on a different grid, 1e-4 to 5e-4 over 4 points. Its optimum came back as 1.00e-4, which is that grid's lower bound, so </w:t>
-      </w:r>
-      <w:r>
-        <w:rPr>
-          <w:b/>
-          <w:bCs/>
-          <w:color w:val="1a1a1a"/>
-          <w:sz w:val="21"/>
-          <w:szCs w:val="21"/>
-        </w:rPr>
-        <w:t xml:space="preserve">the optimum was never bracketed</w:t>
-      </w:r>
-      <w:r>
-        <w:rPr>
-          <w:color w:val="1a1a1a"/>
-          <w:sz w:val="21"/>
-          <w:szCs w:val="21"/>
-        </w:rPr>
-        <w:t xml:space="preserve"> and the true one may sit below it.</w:t>
+        <w:t xml:space="preserve">The optimum was never bracketed</w:t>
+      </w:r>
+      <w:r>
+        <w:rPr>
+          <w:color w:val="1a1a1a"/>
+          <w:sz w:val="21"/>
+          <w:szCs w:val="21"/>
+        </w:rPr>
+        <w:t xml:space="preserve">; the true one may sit below it.</w:t>
       </w:r>
     </w:p>
     <w:p>
@@ -4415,7 +4385,7 @@
           <w:sz w:val="21"/>
           <w:szCs w:val="21"/>
         </w:rPr>
-        <w:t xml:space="preserve">The entire slope therefore rests on one unbracketed boundary value from a different grid. Leave-one-out shows the cost: dropping d256 gives b = −0.54, dropping d128 gives b = −0.94. Anchored at the d512 point those two differ by </w:t>
+        <w:t xml:space="preserve">So the slope rests entirely on one unbracketed boundary value. Leave-one-out shows the cost: dropping d256 gives b = −0.54, dropping d128 gives b = −0.94, which is </w:t>
       </w:r>
       <w:r>
         <w:rPr>
@@ -4438,6 +4408,14 @@
     </w:p>
     <w:p>
       <w:pPr>
+        <w:pStyle w:val="Heading2"/>
+      </w:pPr>
+      <w:r>
+        <w:t xml:space="preserve">7.3  The larger gap: there is no D term</w:t>
+      </w:r>
+    </w:p>
+    <w:p>
+      <w:pPr>
         <w:spacing w:after="120" w:before="0" w:line="276"/>
       </w:pPr>
       <w:r>
@@ -4446,7 +4424,25 @@
           <w:sz w:val="21"/>
           <w:szCs w:val="21"/>
         </w:rPr>
-        <w:t xml:space="preserve">The header comment in </w:t>
+        <w:t xml:space="preserve">All three measurements were taken at </w:t>
+      </w:r>
+      <w:r>
+        <w:rPr>
+          <w:b/>
+          <w:bCs/>
+          <w:color w:val="1a1a1a"/>
+          <w:sz w:val="21"/>
+          <w:szCs w:val="21"/>
+        </w:rPr>
+        <w:t xml:space="preserve">one dataset size, D = 614,400 examples</w:t>
+      </w:r>
+      <w:r>
+        <w:rPr>
+          <w:color w:val="1a1a1a"/>
+          <w:sz w:val="21"/>
+          <w:szCs w:val="21"/>
+        </w:rPr>
+        <w:t xml:space="preserve">. </w:t>
       </w:r>
       <w:r>
         <w:rPr>
@@ -4455,36 +4451,15 @@
           <w:sz w:val="19"/>
           <w:szCs w:val="19"/>
         </w:rPr>
-        <w:t xml:space="preserve">configs.py</w:t>
-      </w:r>
-      <w:r>
-        <w:rPr>
-          <w:color w:val="1a1a1a"/>
-          <w:sz w:val="21"/>
-          <w:szCs w:val="21"/>
-        </w:rPr>
-        <w:t xml:space="preserve"> already flags this ("rests on three points, two of which landed on the same value… the exponent is weakly determined"). Figure 4A is what that looks like.</w:t>
-      </w:r>
-    </w:p>
-    <w:p>
-      <w:pPr>
-        <w:pStyle w:val="Heading2"/>
-      </w:pPr>
-      <w:r>
-        <w:t xml:space="preserve">6.3  The gap I think matters more: there is no D term</w:t>
-      </w:r>
-    </w:p>
-    <w:p>
-      <w:pPr>
-        <w:spacing w:after="120" w:before="0" w:line="276"/>
-      </w:pPr>
-      <w:r>
-        <w:rPr>
-          <w:color w:val="1a1a1a"/>
-          <w:sz w:val="21"/>
-          <w:szCs w:val="21"/>
-        </w:rPr>
-        <w:t xml:space="preserve">All three measurements were taken at </w:t>
+        <w:t xml:space="preserve">lr_for()</w:t>
+      </w:r>
+      <w:r>
+        <w:rPr>
+          <w:color w:val="1a1a1a"/>
+          <w:sz w:val="21"/>
+          <w:szCs w:val="21"/>
+        </w:rPr>
+        <w:t xml:space="preserve"> takes only N, so LR is constant along lines of constant N (Figure 4B). Runs at a fixed N span up to </w:t>
       </w:r>
       <w:r>
         <w:rPr>
@@ -4494,15 +4469,46 @@
           <w:sz w:val="21"/>
           <w:szCs w:val="21"/>
         </w:rPr>
-        <w:t xml:space="preserve">one dataset size, D = 614,400 examples</w:t>
-      </w:r>
-      <w:r>
-        <w:rPr>
-          <w:color w:val="1a1a1a"/>
-          <w:sz w:val="21"/>
-          <w:szCs w:val="21"/>
-        </w:rPr>
-        <w:t xml:space="preserve">, at epochs = 1. </w:t>
+        <w:t xml:space="preserve">9× in D</w:t>
+      </w:r>
+      <w:r>
+        <w:rPr>
+          <w:color w:val="1a1a1a"/>
+          <w:sz w:val="21"/>
+          <w:szCs w:val="21"/>
+        </w:rPr>
+        <w:t xml:space="preserve"> (N = 1.47M trains on 2.5M, 7.4M and 22.4M examples, all at lr = 4.98e-4), and the largest D in the sweep is </w:t>
+      </w:r>
+      <w:r>
+        <w:rPr>
+          <w:b/>
+          <w:bCs/>
+          <w:color w:val="1a1a1a"/>
+          <w:sz w:val="21"/>
+          <w:szCs w:val="21"/>
+        </w:rPr>
+        <w:t xml:space="preserve">95×</w:t>
+      </w:r>
+      <w:r>
+        <w:rPr>
+          <w:color w:val="1a1a1a"/>
+          <w:sz w:val="21"/>
+          <w:szCs w:val="21"/>
+        </w:rPr>
+        <w:t xml:space="preserve"> the tuned one.</w:t>
+      </w:r>
+    </w:p>
+    <w:p>
+      <w:pPr>
+        <w:spacing w:after="120" w:before="0" w:line="276"/>
+      </w:pPr>
+      <w:r>
+        <w:rPr>
+          <w:color w:val="1a1a1a"/>
+          <w:sz w:val="21"/>
+          <w:szCs w:val="21"/>
+        </w:rPr>
+        <w:t xml:space="preserve">The repo already asserts the opposite premise. </w:t>
       </w:r>
       <w:r>
         <w:rPr>
@@ -4511,15 +4517,15 @@
           <w:sz w:val="19"/>
           <w:szCs w:val="19"/>
         </w:rPr>
-        <w:t xml:space="preserve">lr_for()</w:t>
-      </w:r>
-      <w:r>
-        <w:rPr>
-          <w:color w:val="1a1a1a"/>
-          <w:sz w:val="21"/>
-          <w:szCs w:val="21"/>
-        </w:rPr>
-        <w:t xml:space="preserve"> takes only N, so LR is constant along lines of constant N (Figure 4B). In the sweep, runs at a fixed N span up to </w:t>
+        <w:t xml:space="preserve">scripts/fit_lr_scaling.py</w:t>
+      </w:r>
+      <w:r>
+        <w:rPr>
+          <w:color w:val="1a1a1a"/>
+          <w:sz w:val="21"/>
+          <w:szCs w:val="21"/>
+        </w:rPr>
+        <w:t xml:space="preserve"> opens with: "optimal LR depends primarily on </w:t>
       </w:r>
       <w:r>
         <w:rPr>
@@ -4529,16 +4535,55 @@
           <w:sz w:val="21"/>
           <w:szCs w:val="21"/>
         </w:rPr>
-        <w:t xml:space="preserve">9× in D</w:t>
-      </w:r>
-      <w:r>
-        <w:rPr>
-          <w:color w:val="1a1a1a"/>
-          <w:sz w:val="21"/>
-          <w:szCs w:val="21"/>
-        </w:rPr>
-        <w:t xml:space="preserve"> (N = 1.47M trains on 2.5M, 7.4M and 22.4M examples, all at lr = 4.98e-4), and the largest D in the sweep is </w:t>
-      </w:r>
+        <w:t xml:space="preserve">the total number of optimization steps</w:t>
+      </w:r>
+      <w:r>
+        <w:rPr>
+          <w:color w:val="1a1a1a"/>
+          <w:sz w:val="21"/>
+          <w:szCs w:val="21"/>
+        </w:rPr>
+        <w:t xml:space="preserve">", which is D / batch_size, and fits against </w:t>
+      </w:r>
+      <w:r>
+        <w:rPr>
+          <w:rFonts w:ascii="Consolas" w:cs="Consolas" w:eastAsia="Consolas" w:hAnsi="Consolas"/>
+          <w:color w:val="1a1a1a"/>
+          <w:sz w:val="19"/>
+          <w:szCs w:val="19"/>
+        </w:rPr>
+        <w:t xml:space="preserve">train_examples</w:t>
+      </w:r>
+      <w:r>
+        <w:rPr>
+          <w:color w:val="1a1a1a"/>
+          <w:sz w:val="21"/>
+          <w:szCs w:val="21"/>
+        </w:rPr>
+        <w:t xml:space="preserve">. </w:t>
+      </w:r>
+      <w:r>
+        <w:rPr>
+          <w:rFonts w:ascii="Consolas" w:cs="Consolas" w:eastAsia="Consolas" w:hAnsi="Consolas"/>
+          <w:color w:val="1a1a1a"/>
+          <w:sz w:val="19"/>
+          <w:szCs w:val="19"/>
+        </w:rPr>
+        <w:t xml:space="preserve">configs.py</w:t>
+      </w:r>
+      <w:r>
+        <w:rPr>
+          <w:color w:val="1a1a1a"/>
+          <w:sz w:val="21"/>
+          <w:szCs w:val="21"/>
+        </w:rPr>
+        <w:t xml:space="preserve"> fits against parameter count. Two different laws; we deployed the N one.</w:t>
+      </w:r>
+    </w:p>
+    <w:p>
+      <w:pPr>
+        <w:spacing w:after="120" w:before="0" w:line="276"/>
+      </w:pPr>
       <w:r>
         <w:rPr>
           <w:b/>
@@ -4547,45 +4592,15 @@
           <w:sz w:val="21"/>
           <w:szCs w:val="21"/>
         </w:rPr>
-        <w:t xml:space="preserve">95×</w:t>
-      </w:r>
-      <w:r>
-        <w:rPr>
-          <w:color w:val="1a1a1a"/>
-          <w:sz w:val="21"/>
-          <w:szCs w:val="21"/>
-        </w:rPr>
-        <w:t xml:space="preserve"> the D any LR was ever measured at.</w:t>
-      </w:r>
-    </w:p>
-    <w:p>
-      <w:pPr>
-        <w:spacing w:after="120" w:before="0" w:line="276"/>
-      </w:pPr>
-      <w:r>
-        <w:rPr>
-          <w:color w:val="1a1a1a"/>
-          <w:sz w:val="21"/>
-          <w:szCs w:val="21"/>
-        </w:rPr>
-        <w:t xml:space="preserve">This matters because the repo already asserts the opposite premise. </w:t>
-      </w:r>
-      <w:r>
-        <w:rPr>
-          <w:rFonts w:ascii="Consolas" w:cs="Consolas" w:eastAsia="Consolas" w:hAnsi="Consolas"/>
-          <w:color w:val="1a1a1a"/>
-          <w:sz w:val="19"/>
-          <w:szCs w:val="19"/>
-        </w:rPr>
-        <w:t xml:space="preserve">scripts/fit_lr_scaling.py</w:t>
-      </w:r>
-      <w:r>
-        <w:rPr>
-          <w:color w:val="1a1a1a"/>
-          <w:sz w:val="21"/>
-          <w:szCs w:val="21"/>
-        </w:rPr>
-        <w:t xml:space="preserve"> opens with: "For a single-pass run with AdamW + linear warmup + cosine decay, optimal LR depends primarily on </w:t>
+        <w:t xml:space="preserve">Why this is live rather than pedantic. </w:t>
+      </w:r>
+      <w:r>
+        <w:rPr>
+          <w:color w:val="1a1a1a"/>
+          <w:sz w:val="21"/>
+          <w:szCs w:val="21"/>
+        </w:rPr>
+        <w:t xml:space="preserve">Within a rung C is fixed, so N and D are anti-correlated and a missing D term is largely absorbed by the N term. </w:t>
       </w:r>
       <w:r>
         <w:rPr>
@@ -4595,55 +4610,50 @@
           <w:sz w:val="21"/>
           <w:szCs w:val="21"/>
         </w:rPr>
-        <w:t xml:space="preserve">the total number of optimization steps</w:t>
-      </w:r>
-      <w:r>
-        <w:rPr>
-          <w:color w:val="1a1a1a"/>
-          <w:sz w:val="21"/>
-          <w:szCs w:val="21"/>
-        </w:rPr>
-        <w:t xml:space="preserve">." Steps = D / batch_size. So that script fits LR against </w:t>
-      </w:r>
-      <w:r>
-        <w:rPr>
-          <w:rFonts w:ascii="Consolas" w:cs="Consolas" w:eastAsia="Consolas" w:hAnsi="Consolas"/>
-          <w:color w:val="1a1a1a"/>
-          <w:sz w:val="19"/>
-          <w:szCs w:val="19"/>
-        </w:rPr>
-        <w:t xml:space="preserve">train_examples</w:t>
-      </w:r>
-      <w:r>
-        <w:rPr>
-          <w:color w:val="1a1a1a"/>
-          <w:sz w:val="21"/>
-          <w:szCs w:val="21"/>
-        </w:rPr>
-        <w:t xml:space="preserve"> (D), while </w:t>
-      </w:r>
-      <w:r>
-        <w:rPr>
-          <w:rFonts w:ascii="Consolas" w:cs="Consolas" w:eastAsia="Consolas" w:hAnsi="Consolas"/>
-          <w:color w:val="1a1a1a"/>
-          <w:sz w:val="19"/>
-          <w:szCs w:val="19"/>
-        </w:rPr>
-        <w:t xml:space="preserve">configs.py</w:t>
-      </w:r>
-      <w:r>
-        <w:rPr>
-          <w:color w:val="1a1a1a"/>
-          <w:sz w:val="21"/>
-          <w:szCs w:val="21"/>
-        </w:rPr>
-        <w:t xml:space="preserve"> fits it against parameter count (N). They are two different laws, and the one we deployed is the N one.</w:t>
+        <w:t xml:space="preserve">Across rungs it is not</w:t>
+      </w:r>
+      <w:r>
+        <w:rPr>
+          <w:color w:val="1a1a1a"/>
+          <w:sz w:val="21"/>
+          <w:szCs w:val="21"/>
+        </w:rPr>
+        <w:t xml:space="preserve">: the same N appears at three different D. If the optimum falls with D, as the cosine-schedule argument says, then at fixed N the large-budget runs train at too high an LR and the error grows with the budget. That would produce exactly what we see: degradation switching on at high C, on both metrics, unrelated to repetition.</w:t>
       </w:r>
     </w:p>
     <w:p>
       <w:pPr>
         <w:spacing w:after="120" w:before="0" w:line="276"/>
       </w:pPr>
+      <w:r>
+        <w:rPr>
+          <w:color w:val="1a1a1a"/>
+          <w:sz w:val="21"/>
+          <w:szCs w:val="21"/>
+        </w:rPr>
+        <w:t xml:space="preserve">Probably not the whole story, since section 6's clean low-chroma law is hard to get out of it. But it is the only remaining explanation I cannot rule out, and it is cheap to rule out.</w:t>
+      </w:r>
+    </w:p>
+    <w:p>
+      <w:pPr>
+        <w:pStyle w:val="Heading2"/>
+      </w:pPr>
+      <w:r>
+        <w:t xml:space="preserve">7.4  Proposed experiment</w:t>
+      </w:r>
+    </w:p>
+    <w:p>
+      <w:pPr>
+        <w:spacing w:after="120" w:before="0" w:line="276"/>
+      </w:pPr>
+      <w:r>
+        <w:rPr>
+          <w:color w:val="1a1a1a"/>
+          <w:sz w:val="21"/>
+          <w:szCs w:val="21"/>
+        </w:rPr>
+        <w:t xml:space="preserve">Replace the 1-D law with </w:t>
+      </w:r>
       <w:r>
         <w:rPr>
           <w:b/>
@@ -4652,15 +4662,16 @@
           <w:sz w:val="21"/>
           <w:szCs w:val="21"/>
         </w:rPr>
-        <w:t xml:space="preserve">Why this is a live confound rather than a nitpick. </w:t>
-      </w:r>
-      <w:r>
-        <w:rPr>
-          <w:color w:val="1a1a1a"/>
-          <w:sz w:val="21"/>
-          <w:szCs w:val="21"/>
-        </w:rPr>
-        <w:t xml:space="preserve">Within a rung, C = 6ND is constant, so N and D are perfectly anti-correlated and a missing D term is largely absorbed by the N term. </w:t>
+        <w:t xml:space="preserve">lr_opt(N, D) = A · N</w:t>
+      </w:r>
+      <w:r>
+        <w:rPr>
+          <w:color w:val="1a1a1a"/>
+          <w:sz w:val="21"/>
+          <w:szCs w:val="21"/>
+          <w:vertAlign w:val="superscript"/>
+        </w:rPr>
+        <w:t xml:space="preserve">b</w:t>
       </w:r>
       <w:r>
         <w:rPr>
@@ -4670,59 +4681,7 @@
           <w:sz w:val="21"/>
           <w:szCs w:val="21"/>
         </w:rPr>
-        <w:t xml:space="preserve">Across rungs it is not</w:t>
-      </w:r>
-      <w:r>
-        <w:rPr>
-          <w:color w:val="1a1a1a"/>
-          <w:sz w:val="21"/>
-          <w:szCs w:val="21"/>
-        </w:rPr>
-        <w:t xml:space="preserve">: the same N appears at three different D. If the true optimum falls with D, as the cosine-schedule argument says it should, then at fixed N the large-budget runs are being trained at too high an LR, and the error grows with the budget. That mechanism would produce exactly what we observe: degradation that switches on at high C, shows up on both metrics, and has nothing to do with repetition.</w:t>
-      </w:r>
-    </w:p>
-    <w:p>
-      <w:pPr>
-        <w:spacing w:after="120" w:before="0" w:line="276"/>
-      </w:pPr>
-      <w:r>
-        <w:rPr>
-          <w:color w:val="1a1a1a"/>
-          <w:sz w:val="21"/>
-          <w:szCs w:val="21"/>
-        </w:rPr>
-        <w:t xml:space="preserve">I do not think it is the whole story, because section 5's clean low-chroma law is hard to get out of it. But it is the only remaining explanation I cannot currently rule out, and it is cheap to rule out.</w:t>
-      </w:r>
-    </w:p>
-    <w:p>
-      <w:pPr>
-        <w:pStyle w:val="Heading2"/>
-      </w:pPr>
-      <w:r>
-        <w:t xml:space="preserve">6.4  Proposed experiment</w:t>
-      </w:r>
-    </w:p>
-    <w:p>
-      <w:pPr>
-        <w:spacing w:after="120" w:before="0" w:line="276"/>
-      </w:pPr>
-      <w:r>
-        <w:rPr>
-          <w:color w:val="1a1a1a"/>
-          <w:sz w:val="21"/>
-          <w:szCs w:val="21"/>
-        </w:rPr>
-        <w:t xml:space="preserve">Replace the 1-D law with a 2-D one, </w:t>
-      </w:r>
-      <w:r>
-        <w:rPr>
-          <w:b/>
-          <w:bCs/>
-          <w:color w:val="1a1a1a"/>
-          <w:sz w:val="21"/>
-          <w:szCs w:val="21"/>
-        </w:rPr>
-        <w:t xml:space="preserve">lr_opt(N, D) = A · N</w:t>
+        <w:t xml:space="preserve"> · D</w:t>
       </w:r>
       <w:r>
         <w:rPr>
@@ -4731,25 +4690,6 @@
           <w:szCs w:val="21"/>
           <w:vertAlign w:val="superscript"/>
         </w:rPr>
-        <w:t xml:space="preserve">b</w:t>
-      </w:r>
-      <w:r>
-        <w:rPr>
-          <w:b/>
-          <w:bCs/>
-          <w:color w:val="1a1a1a"/>
-          <w:sz w:val="21"/>
-          <w:szCs w:val="21"/>
-        </w:rPr>
-        <w:t xml:space="preserve"> · D</w:t>
-      </w:r>
-      <w:r>
-        <w:rPr>
-          <w:color w:val="1a1a1a"/>
-          <w:sz w:val="21"/>
-          <w:szCs w:val="21"/>
-          <w:vertAlign w:val="superscript"/>
-        </w:rPr>
         <w:t xml:space="preserve">c</w:t>
       </w:r>
       <w:r>
@@ -4758,7 +4698,7 @@
           <w:sz w:val="21"/>
           <w:szCs w:val="21"/>
         </w:rPr>
-        <w:t xml:space="preserve">, fitted on a grid where both axes move independently.</w:t>
+        <w:t xml:space="preserve">, fitted where both axes move independently.</w:t>
       </w:r>
     </w:p>
     <w:p>
@@ -4778,15 +4718,15 @@
           <w:sz w:val="21"/>
           <w:szCs w:val="21"/>
         </w:rPr>
-        <w:t xml:space="preserve">Minimal version, 3 LR sweeps (~37 GPU-hours). </w:t>
-      </w:r>
-      <w:r>
-        <w:rPr>
-          <w:color w:val="1a1a1a"/>
-          <w:sz w:val="21"/>
-          <w:szCs w:val="21"/>
-        </w:rPr>
-        <w:t xml:space="preserve">Hold N at one mid-ladder size (d128/se2, N = 0.77M, which we have already measured) and run </w:t>
+        <w:t xml:space="preserve">Minimal, 3 sweeps, ~37 GPU-hours. </w:t>
+      </w:r>
+      <w:r>
+        <w:rPr>
+          <w:color w:val="1a1a1a"/>
+          <w:sz w:val="21"/>
+          <w:szCs w:val="21"/>
+        </w:rPr>
+        <w:t xml:space="preserve">Hold N at d128/se2 (0.77M, already measured) and run </w:t>
       </w:r>
       <w:r>
         <w:rPr>
@@ -4803,7 +4743,7 @@
           <w:sz w:val="21"/>
           <w:szCs w:val="21"/>
         </w:rPr>
-        <w:t xml:space="preserve"> at D ∈ {0.6M, 4M, 24M}, which brackets the sweep's real D range. This measures c directly at the one N where we have a point. If |c| is inside noise of zero, the current law is fine and we stop and say so.</w:t>
+        <w:t xml:space="preserve"> at D ∈ {0.6M, 4M, 24M}, bracketing the sweep's real D range. Measures c directly. If |c| is inside noise of zero, the current law is fine and we say so.</w:t>
       </w:r>
     </w:p>
     <w:p>
@@ -4823,15 +4763,15 @@
           <w:sz w:val="21"/>
           <w:szCs w:val="21"/>
         </w:rPr>
-        <w:t xml:space="preserve">Full version, 3×3 grid, 9 sweeps (~110 GPU-hours). </w:t>
-      </w:r>
-      <w:r>
-        <w:rPr>
-          <w:color w:val="1a1a1a"/>
-          <w:sz w:val="21"/>
-          <w:szCs w:val="21"/>
-        </w:rPr>
-        <w:t xml:space="preserve">Only if c comes back clearly nonzero. Gives b and c jointly and replaces </w:t>
+        <w:t xml:space="preserve">Full, 3×3 grid, 9 sweeps, ~110 GPU-hours. </w:t>
+      </w:r>
+      <w:r>
+        <w:rPr>
+          <w:color w:val="1a1a1a"/>
+          <w:sz w:val="21"/>
+          <w:szCs w:val="21"/>
+        </w:rPr>
+        <w:t xml:space="preserve">Only if c is clearly nonzero. Gives b and c jointly and replaces </w:t>
       </w:r>
       <w:r>
         <w:rPr>
@@ -4848,7 +4788,7 @@
           <w:sz w:val="21"/>
           <w:szCs w:val="21"/>
         </w:rPr>
-        <w:t xml:space="preserve"> outright.</w:t>
+        <w:t xml:space="preserve">.</w:t>
       </w:r>
     </w:p>
     <w:p>
@@ -4872,14 +4812,6 @@
       </w:r>
       <w:r>
         <w:rPr>
-          <w:color w:val="1a1a1a"/>
-          <w:sz w:val="21"/>
-          <w:szCs w:val="21"/>
-        </w:rPr>
-        <w:t xml:space="preserve">Use </w:t>
-      </w:r>
-      <w:r>
-        <w:rPr>
           <w:rFonts w:ascii="Consolas" w:cs="Consolas" w:eastAsia="Consolas" w:hAnsi="Consolas"/>
           <w:color w:val="1a1a1a"/>
           <w:sz w:val="19"/>
@@ -4893,12 +4825,12 @@
           <w:sz w:val="21"/>
           <w:szCs w:val="21"/>
         </w:rPr>
-        <w:t xml:space="preserve"> (the span the slurm header already suggests) and reject any result that lands on an endpoint. That alone fixes the d512 point.</w:t>
-      </w:r>
-    </w:p>
-    <w:p>
-      <w:pPr>
-        <w:spacing w:after="120" w:before="90" w:line="276"/>
+        <w:t xml:space="preserve">, and reject any result landing on an endpoint.</w:t>
+      </w:r>
+    </w:p>
+    <w:p>
+      <w:pPr>
+        <w:spacing w:after="120" w:before="80" w:line="276"/>
       </w:pPr>
       <w:r>
         <w:rPr>
@@ -4908,15 +4840,15 @@
           <w:sz w:val="21"/>
           <w:szCs w:val="21"/>
         </w:rPr>
-        <w:t xml:space="preserve">The question for you: </w:t>
-      </w:r>
-      <w:r>
-        <w:rPr>
-          <w:color w:val="1a1a1a"/>
-          <w:sz w:val="21"/>
-          <w:szCs w:val="21"/>
-        </w:rPr>
-        <w:t xml:space="preserve">is it worth ~1.5 GPU-days to close the LR confound before we commit to "the ceiling is problem-side"? My own read is yes for the 3-sweep version, because it is the last mechanism that could produce budget-dependent degradation, and a measured c ≈ 0 lets us state the conclusion cleanly instead of caveating it. I would run the 9-sweep version only if the cheap one comes back nonzero.</w:t>
+        <w:t xml:space="preserve">The question: </w:t>
+      </w:r>
+      <w:r>
+        <w:rPr>
+          <w:color w:val="1a1a1a"/>
+          <w:sz w:val="21"/>
+          <w:szCs w:val="21"/>
+        </w:rPr>
+        <w:t xml:space="preserve">is ~1.5 GPU-days worth spending to close this before we commit to "the ceiling is problem-side"? My read is yes for the 3-sweep version, since it is the last mechanism that could produce budget-dependent degradation, and a measured c ≈ 0 lets us state the conclusion cleanly. The 9-sweep version only if the cheap one comes back nonzero.</w:t>
       </w:r>
     </w:p>
     <w:p>
@@ -4924,7 +4856,7 @@
         <w:pStyle w:val="Heading1"/>
       </w:pPr>
       <w:r>
-        <w:t xml:space="preserve">7.  Caveats</w:t>
+        <w:t xml:space="preserve">8.  Caveats</w:t>
       </w:r>
     </w:p>
     <w:p>
@@ -4978,7 +4910,7 @@
           <w:sz w:val="21"/>
           <w:szCs w:val="21"/>
         </w:rPr>
-        <w:t xml:space="preserve">Largest model here is 17.8M parameters. The turn could be an artefact of the size window; the counter is that the same window gave a clean low-chroma law.</w:t>
+        <w:t xml:space="preserve">Largest model here is 17.8M. The turn could be an artefact of the size window; the counter is that the same window gave a clean low-chroma law.</w:t>
       </w:r>
     </w:p>
     <w:p>
@@ -5014,7 +4946,7 @@
           <w:sz w:val="21"/>
           <w:szCs w:val="21"/>
         </w:rPr>
-        <w:t xml:space="preserve">LR has no D term (section 6). Unablated.</w:t>
+        <w:t xml:space="preserve">LR has no D term. Unablated.</w:t>
       </w:r>
     </w:p>
     <w:p>
@@ -5022,7 +4954,7 @@
         <w:pStyle w:val="Heading1"/>
       </w:pPr>
       <w:r>
-        <w:t xml:space="preserve">8.  Takeaway</w:t>
+        <w:t xml:space="preserve">9.  Takeaway</w:t>
       </w:r>
     </w:p>
     <w:p>
@@ -5040,7 +4972,7 @@
           <w:sz w:val="21"/>
           <w:szCs w:val="21"/>
         </w:rPr>
-        <w:t xml:space="preserve">Real scaling study: 48 runs, Porian-corrected, aspect-controlled, 40M corpus.</w:t>
+        <w:t xml:space="preserve">48 runs, Porian-corrected, aspect-controlled, 40M corpus, analytic FLOP axis.</w:t>
       </w:r>
     </w:p>
     <w:p>
@@ -5130,7 +5062,7 @@
           <w:sz w:val="21"/>
           <w:szCs w:val="21"/>
         </w:rPr>
-        <w:t xml:space="preserve">If that reading holds, the payoff is inference-time search and RL against the simulator, not a bigger pretrain. Two cheap experiments decide it: the oracle-floor eval (section 5) and the D-term LR sweep (section 6).</w:t>
+        <w:t xml:space="preserve">If that holds, the payoff is inference-time search and RL against the simulator, not a bigger pretrain. Two cheap experiments decide it: the oracle-floor eval (section 6) and the D-term LR sweep (section 7).</w:t>
       </w:r>
     </w:p>
     <w:sectPr>

</xml_diff>

<commit_message>
State the compute axis directly instead of denying the heuristic
"The compute axis is not 6ND" leads with the thing it is refuting, so a
skim of the method section comes away with 6ND on the page. The bullet
now opens with C = 3 * F(N) * D and refers to the alternative as the
per-token heuristic, which says the same thing without putting the
wrong formula in front of a reader who is scanning.

Co-Authored-By: Claude Opus 5 <noreply@anthropic.com>
Claude-Session: https://claude.ai/code/session_01XghrhY6CG3yHYV4KvDtBnM
</commit_message>
<xml_diff>
--- a/analyses/scaling/results/INDIGO_scaling_meeting.docx
+++ b/analyses/scaling/results/INDIGO_scaling_meeting.docx
@@ -273,7 +273,15 @@
           <w:sz w:val="21"/>
           <w:szCs w:val="21"/>
         </w:rPr>
-        <w:t xml:space="preserve">The compute axis is not 6ND. </w:t>
+        <w:t xml:space="preserve">Compute axis: C = 3 · F(N) · D</w:t>
+      </w:r>
+      <w:r>
+        <w:rPr>
+          <w:color w:val="1a1a1a"/>
+          <w:sz w:val="21"/>
+          <w:szCs w:val="21"/>
+        </w:rPr>
+        <w:t xml:space="preserve">, with the forward cost per example F computed analytically in </w:t>
       </w:r>
       <w:r>
         <w:rPr>
@@ -290,7 +298,7 @@
           <w:sz w:val="21"/>
           <w:szCs w:val="21"/>
         </w:rPr>
-        <w:t xml:space="preserve"> computes forward FLOPs per example analytically and sets C = 3 · F(N) · D. The pointer head runs per (position, slot), 352 times per example, and the slot encoder runs over 32 pool slots rather than the 11-position sequence. Over this ladder C/(N·D) runs from 306 down to 218, so 6ND would understate compute by 36× to 51× and the error itself drifts 1.4× across the grid. This is Porian correction #1, far larger here than in the paper.</w:t>
+        <w:t xml:space="preserve">. The per-token heuristic does not apply here: the pointer head runs per (position, slot), 352 times per example, and the slot encoder runs over 32 pool slots rather than the 11-position decoder sequence. Over this ladder C/(N·D) falls from 306 to 218, so a per-token count would be off by 36× to 51× and the error itself drifts 1.4× across the grid. This is Porian correction #1, far larger here than in the paper.</w:t>
       </w:r>
     </w:p>
     <w:p>

</xml_diff>